<commit_message>
MATH1201 Unit 7: add Task 1 GeoGebra graph (tan x and tan 2x)
Co-Authored-By: Claude Opus 5.5 <noreply@anthropic.com>
</commit_message>
<xml_diff>
--- a/MATH1201_College_Algebra/Unit7_Trigonometry_II/Assignment/Unit7_Assignment_Activity.docx
+++ b/MATH1201_College_Algebra/Unit7_Trigonometry_II/Assignment/Unit7_Assignment_Activity.docx
@@ -1069,13 +1069,38 @@
         <w:jc w:val="center"/>
       </w:pPr>
       <w:r>
-        <w:rPr>
-          <w:rFonts w:ascii="Times New Roman" w:hAnsi="Times New Roman"/>
-          <w:b/>
-          <w:i w:val="0"/>
-          <w:sz w:val="24"/>
-        </w:rPr>
-        <w:t>[ Insert GeoGebra graph: figures/fig1_tan_graphs.png ]</w:t>
+        <w:drawing>
+          <wp:inline xmlns:a="http://schemas.openxmlformats.org/drawingml/2006/main" xmlns:pic="http://schemas.openxmlformats.org/drawingml/2006/picture">
+            <wp:extent cx="5486400" cy="3653942"/>
+            <wp:docPr id="1" name="Picture 1"/>
+            <wp:cNvGraphicFramePr>
+              <a:graphicFrameLocks noChangeAspect="1"/>
+            </wp:cNvGraphicFramePr>
+            <a:graphic>
+              <a:graphicData uri="http://schemas.openxmlformats.org/drawingml/2006/picture">
+                <pic:pic>
+                  <pic:nvPicPr>
+                    <pic:cNvPr id="0" name="fig1_tan_graphs.png"/>
+                    <pic:cNvPicPr/>
+                  </pic:nvPicPr>
+                  <pic:blipFill>
+                    <a:blip r:embed="rId10"/>
+                    <a:stretch>
+                      <a:fillRect/>
+                    </a:stretch>
+                  </pic:blipFill>
+                  <pic:spPr>
+                    <a:xfrm>
+                      <a:off x="0" y="0"/>
+                      <a:ext cx="5486400" cy="3653942"/>
+                    </a:xfrm>
+                    <a:prstGeom prst="rect"/>
+                  </pic:spPr>
+                </pic:pic>
+              </a:graphicData>
+            </a:graphic>
+          </wp:inline>
+        </w:drawing>
       </w:r>
     </w:p>
     <w:p>
@@ -4287,7 +4312,7 @@
         </w:rPr>
         <w:t xml:space="preserve"> (2nd ed.). OpenStax. </w:t>
       </w:r>
-      <w:hyperlink r:id="rId10">
+      <w:hyperlink r:id="rId11">
         <w:r>
           <w:rPr>
             <w:rFonts w:ascii="Times New Roman" w:hAnsi="Times New Roman"/>
@@ -4331,7 +4356,7 @@
         </w:rPr>
         <w:t xml:space="preserve"> [Video]. YouTube. </w:t>
       </w:r>
-      <w:hyperlink r:id="rId11">
+      <w:hyperlink r:id="rId12">
         <w:r>
           <w:rPr>
             <w:rFonts w:ascii="Times New Roman" w:hAnsi="Times New Roman"/>
@@ -4375,7 +4400,7 @@
         </w:rPr>
         <w:t xml:space="preserve"> [Video]. YouTube. </w:t>
       </w:r>
-      <w:hyperlink r:id="rId12">
+      <w:hyperlink r:id="rId13">
         <w:r>
           <w:rPr>
             <w:rFonts w:ascii="Times New Roman" w:hAnsi="Times New Roman"/>
@@ -4419,7 +4444,7 @@
         </w:rPr>
         <w:t xml:space="preserve"> [Video]. YouTube. </w:t>
       </w:r>
-      <w:hyperlink r:id="rId13">
+      <w:hyperlink r:id="rId14">
         <w:r>
           <w:rPr>
             <w:rFonts w:ascii="Times New Roman" w:hAnsi="Times New Roman"/>
@@ -4463,7 +4488,7 @@
         </w:rPr>
         <w:t xml:space="preserve"> [Video]. YouTube. </w:t>
       </w:r>
-      <w:hyperlink r:id="rId14">
+      <w:hyperlink r:id="rId15">
         <w:r>
           <w:rPr>
             <w:rFonts w:ascii="Times New Roman" w:hAnsi="Times New Roman"/>
@@ -4507,7 +4532,7 @@
         </w:rPr>
         <w:t xml:space="preserve"> [Video]. YouTube. </w:t>
       </w:r>
-      <w:hyperlink r:id="rId15">
+      <w:hyperlink r:id="rId16">
         <w:r>
           <w:rPr>
             <w:rFonts w:ascii="Times New Roman" w:hAnsi="Times New Roman"/>
@@ -4551,7 +4576,7 @@
         </w:rPr>
         <w:t xml:space="preserve"> [Video]. YouTube. </w:t>
       </w:r>
-      <w:hyperlink r:id="rId16">
+      <w:hyperlink r:id="rId17">
         <w:r>
           <w:rPr>
             <w:rFonts w:ascii="Times New Roman" w:hAnsi="Times New Roman"/>
@@ -4595,7 +4620,7 @@
         </w:rPr>
         <w:t xml:space="preserve">. American Institute of Mathematics. </w:t>
       </w:r>
-      <w:hyperlink r:id="rId17">
+      <w:hyperlink r:id="rId18">
         <w:r>
           <w:rPr>
             <w:rFonts w:ascii="Times New Roman" w:hAnsi="Times New Roman"/>

</xml_diff>